<commit_message>
fix(experiments): stabilize DocReader fixture anchors
Co-authored-by: arena-agent <297053741+arena-agent@users.noreply.github.com>
</commit_message>
<xml_diff>
--- a/testdata/winner_lifecycle_corpus/docreader_fixture/docs/fixture_cross_issuer_a.docx
+++ b/testdata/winner_lifecycle_corpus/docreader_fixture/docs/fixture_cross_issuer_a.docx
@@ -4,12 +4,7 @@
   <w:body>
     <w:p>
       <w:r>
-        <w:t xml:space="preserve">Synthetic financing rule</w:t>
-      </w:r>
-    </w:p>
-    <w:p>
-      <w:r>
-        <w:t xml:space="preserve">The maximum financing limit for one domestic invoice is 300 CNY.</w:t>
+        <w:t xml:space="preserve">国内出差餐费补贴每日标准为 300 元。</w:t>
       </w:r>
     </w:p>
     <w:sectPr>

</xml_diff>